<commit_message>
The AGR binder prints its three-value cards
Word held kit/UNDERCITY_Binder_AGR.docx open when the twelve three-value faults landed (30cdbd0), so the colour kit still printed F-510 and F-609 with two values. Rebuilt from the same build/binder_content.json with the same renderer once the document was closed, and the manifest re-fingerprinted. The Word page check reads all six colour binders at nine pages, every section where the cover says; the kit, mono, binder and three-value suites pass.

Co-Authored-By: Claude Fable 5.1 <noreply@anthropic.com>
</commit_message>
<xml_diff>
--- a/kit/UNDERCITY_Binder_AGR.docx
+++ b/kit/UNDERCITY_Binder_AGR.docx
@@ -8323,9 +8323,9 @@
             <w:tcW w:type="dxa" w:w="3000"/>
             <w:shd w:fill="DBEFDE" w:color="auto" w:val="clear"/>
             <w:tcMar>
-              <w:top w:type="dxa" w:w="30"/>
+              <w:top w:type="dxa" w:w="20"/>
               <w:left w:type="dxa" w:w="110"/>
-              <w:bottom w:type="dxa" w:w="30"/>
+              <w:bottom w:type="dxa" w:w="20"/>
               <w:right w:type="dxa" w:w="90"/>
             </w:tcMar>
             <w:vAlign w:val="center"/>
@@ -8353,9 +8353,9 @@
             <w:gridSpan w:val="2"/>
             <w:shd w:fill="DBEFDE" w:color="auto" w:val="clear"/>
             <w:tcMar>
-              <w:top w:type="dxa" w:w="30"/>
+              <w:top w:type="dxa" w:w="20"/>
               <w:left w:type="dxa" w:w="110"/>
-              <w:bottom w:type="dxa" w:w="30"/>
+              <w:bottom w:type="dxa" w:w="20"/>
               <w:right w:type="dxa" w:w="90"/>
             </w:tcMar>
             <w:vAlign w:val="center"/>
@@ -8386,16 +8386,16 @@
           <w:tcPr>
             <w:tcW w:type="dxa" w:w="3000"/>
             <w:tcMar>
-              <w:top w:type="dxa" w:w="35"/>
+              <w:top w:type="dxa" w:w="25"/>
               <w:left w:type="dxa" w:w="110"/>
-              <w:bottom w:type="dxa" w:w="45"/>
-              <w:right w:type="dxa" w:w="90"/>
-            </w:tcMar>
-            <w:vAlign w:val="top"/>
-          </w:tcPr>
-          <w:p>
-            <w:pPr>
-              <w:spacing w:after="10"/>
+              <w:bottom w:type="dxa" w:w="30"/>
+              <w:right w:type="dxa" w:w="90"/>
+            </w:tcMar>
+            <w:vAlign w:val="top"/>
+          </w:tcPr>
+          <w:p>
+            <w:pPr>
+              <w:spacing w:after="0"/>
             </w:pPr>
             <w:r>
               <w:rPr>
@@ -8431,16 +8431,16 @@
           <w:tcPr>
             <w:tcW w:type="dxa" w:w="3000"/>
             <w:tcMar>
-              <w:top w:type="dxa" w:w="35"/>
+              <w:top w:type="dxa" w:w="25"/>
               <w:left w:type="dxa" w:w="110"/>
-              <w:bottom w:type="dxa" w:w="45"/>
-              <w:right w:type="dxa" w:w="90"/>
-            </w:tcMar>
-            <w:vAlign w:val="top"/>
-          </w:tcPr>
-          <w:p>
-            <w:pPr>
-              <w:spacing w:after="10"/>
+              <w:bottom w:type="dxa" w:w="30"/>
+              <w:right w:type="dxa" w:w="90"/>
+            </w:tcMar>
+            <w:vAlign w:val="top"/>
+          </w:tcPr>
+          <w:p>
+            <w:pPr>
+              <w:spacing w:after="0"/>
             </w:pPr>
             <w:r>
               <w:rPr>
@@ -8476,16 +8476,16 @@
           <w:tcPr>
             <w:tcW w:type="dxa" w:w="3000"/>
             <w:tcMar>
-              <w:top w:type="dxa" w:w="35"/>
+              <w:top w:type="dxa" w:w="25"/>
               <w:left w:type="dxa" w:w="110"/>
-              <w:bottom w:type="dxa" w:w="45"/>
-              <w:right w:type="dxa" w:w="90"/>
-            </w:tcMar>
-            <w:vAlign w:val="top"/>
-          </w:tcPr>
-          <w:p>
-            <w:pPr>
-              <w:spacing w:after="10"/>
+              <w:bottom w:type="dxa" w:w="30"/>
+              <w:right w:type="dxa" w:w="90"/>
+            </w:tcMar>
+            <w:vAlign w:val="top"/>
+          </w:tcPr>
+          <w:p>
+            <w:pPr>
+              <w:spacing w:after="0"/>
             </w:pPr>
             <w:r>
               <w:rPr>
@@ -8526,16 +8526,16 @@
           <w:tcPr>
             <w:tcW w:type="dxa" w:w="3000"/>
             <w:tcMar>
-              <w:top w:type="dxa" w:w="35"/>
+              <w:top w:type="dxa" w:w="25"/>
               <w:left w:type="dxa" w:w="110"/>
-              <w:bottom w:type="dxa" w:w="45"/>
-              <w:right w:type="dxa" w:w="90"/>
-            </w:tcMar>
-            <w:vAlign w:val="top"/>
-          </w:tcPr>
-          <w:p>
-            <w:pPr>
-              <w:spacing w:after="10"/>
+              <w:bottom w:type="dxa" w:w="30"/>
+              <w:right w:type="dxa" w:w="90"/>
+            </w:tcMar>
+            <w:vAlign w:val="top"/>
+          </w:tcPr>
+          <w:p>
+            <w:pPr>
+              <w:spacing w:after="0"/>
             </w:pPr>
             <w:r>
               <w:rPr>
@@ -8571,16 +8571,16 @@
           <w:tcPr>
             <w:tcW w:type="dxa" w:w="3000"/>
             <w:tcMar>
-              <w:top w:type="dxa" w:w="35"/>
+              <w:top w:type="dxa" w:w="25"/>
               <w:left w:type="dxa" w:w="110"/>
-              <w:bottom w:type="dxa" w:w="45"/>
-              <w:right w:type="dxa" w:w="90"/>
-            </w:tcMar>
-            <w:vAlign w:val="top"/>
-          </w:tcPr>
-          <w:p>
-            <w:pPr>
-              <w:spacing w:after="10"/>
+              <w:bottom w:type="dxa" w:w="30"/>
+              <w:right w:type="dxa" w:w="90"/>
+            </w:tcMar>
+            <w:vAlign w:val="top"/>
+          </w:tcPr>
+          <w:p>
+            <w:pPr>
+              <w:spacing w:after="0"/>
             </w:pPr>
             <w:r>
               <w:rPr>
@@ -8616,16 +8616,16 @@
           <w:tcPr>
             <w:tcW w:type="dxa" w:w="3000"/>
             <w:tcMar>
-              <w:top w:type="dxa" w:w="35"/>
+              <w:top w:type="dxa" w:w="25"/>
               <w:left w:type="dxa" w:w="110"/>
-              <w:bottom w:type="dxa" w:w="45"/>
-              <w:right w:type="dxa" w:w="90"/>
-            </w:tcMar>
-            <w:vAlign w:val="top"/>
-          </w:tcPr>
-          <w:p>
-            <w:pPr>
-              <w:spacing w:after="10"/>
+              <w:bottom w:type="dxa" w:w="30"/>
+              <w:right w:type="dxa" w:w="90"/>
+            </w:tcMar>
+            <w:vAlign w:val="top"/>
+          </w:tcPr>
+          <w:p>
+            <w:pPr>
+              <w:spacing w:after="0"/>
             </w:pPr>
             <w:r>
               <w:rPr>
@@ -8661,7 +8661,7 @@
     </w:tbl>
     <w:p>
       <w:pPr>
-        <w:spacing w:after="40"/>
+        <w:spacing w:after="24"/>
       </w:pPr>
     </w:p>
     <w:tbl>
@@ -8690,9 +8690,9 @@
             <w:tcW w:type="dxa" w:w="3000"/>
             <w:shd w:fill="DBEFDE" w:color="auto" w:val="clear"/>
             <w:tcMar>
-              <w:top w:type="dxa" w:w="30"/>
+              <w:top w:type="dxa" w:w="20"/>
               <w:left w:type="dxa" w:w="110"/>
-              <w:bottom w:type="dxa" w:w="30"/>
+              <w:bottom w:type="dxa" w:w="20"/>
               <w:right w:type="dxa" w:w="90"/>
             </w:tcMar>
             <w:vAlign w:val="center"/>
@@ -8720,9 +8720,9 @@
             <w:gridSpan w:val="2"/>
             <w:shd w:fill="DBEFDE" w:color="auto" w:val="clear"/>
             <w:tcMar>
-              <w:top w:type="dxa" w:w="30"/>
+              <w:top w:type="dxa" w:w="20"/>
               <w:left w:type="dxa" w:w="110"/>
-              <w:bottom w:type="dxa" w:w="30"/>
+              <w:bottom w:type="dxa" w:w="20"/>
               <w:right w:type="dxa" w:w="90"/>
             </w:tcMar>
             <w:vAlign w:val="center"/>
@@ -8753,16 +8753,16 @@
           <w:tcPr>
             <w:tcW w:type="dxa" w:w="3000"/>
             <w:tcMar>
-              <w:top w:type="dxa" w:w="35"/>
+              <w:top w:type="dxa" w:w="25"/>
               <w:left w:type="dxa" w:w="110"/>
-              <w:bottom w:type="dxa" w:w="45"/>
-              <w:right w:type="dxa" w:w="90"/>
-            </w:tcMar>
-            <w:vAlign w:val="top"/>
-          </w:tcPr>
-          <w:p>
-            <w:pPr>
-              <w:spacing w:after="10"/>
+              <w:bottom w:type="dxa" w:w="30"/>
+              <w:right w:type="dxa" w:w="90"/>
+            </w:tcMar>
+            <w:vAlign w:val="top"/>
+          </w:tcPr>
+          <w:p>
+            <w:pPr>
+              <w:spacing w:after="0"/>
             </w:pPr>
             <w:r>
               <w:rPr>
@@ -8798,16 +8798,16 @@
           <w:tcPr>
             <w:tcW w:type="dxa" w:w="3000"/>
             <w:tcMar>
-              <w:top w:type="dxa" w:w="35"/>
+              <w:top w:type="dxa" w:w="25"/>
               <w:left w:type="dxa" w:w="110"/>
-              <w:bottom w:type="dxa" w:w="45"/>
-              <w:right w:type="dxa" w:w="90"/>
-            </w:tcMar>
-            <w:vAlign w:val="top"/>
-          </w:tcPr>
-          <w:p>
-            <w:pPr>
-              <w:spacing w:after="10"/>
+              <w:bottom w:type="dxa" w:w="30"/>
+              <w:right w:type="dxa" w:w="90"/>
+            </w:tcMar>
+            <w:vAlign w:val="top"/>
+          </w:tcPr>
+          <w:p>
+            <w:pPr>
+              <w:spacing w:after="0"/>
             </w:pPr>
             <w:r>
               <w:rPr>
@@ -8843,16 +8843,16 @@
           <w:tcPr>
             <w:tcW w:type="dxa" w:w="3000"/>
             <w:tcMar>
-              <w:top w:type="dxa" w:w="35"/>
+              <w:top w:type="dxa" w:w="25"/>
               <w:left w:type="dxa" w:w="110"/>
-              <w:bottom w:type="dxa" w:w="45"/>
-              <w:right w:type="dxa" w:w="90"/>
-            </w:tcMar>
-            <w:vAlign w:val="top"/>
-          </w:tcPr>
-          <w:p>
-            <w:pPr>
-              <w:spacing w:after="10"/>
+              <w:bottom w:type="dxa" w:w="30"/>
+              <w:right w:type="dxa" w:w="90"/>
+            </w:tcMar>
+            <w:vAlign w:val="top"/>
+          </w:tcPr>
+          <w:p>
+            <w:pPr>
+              <w:spacing w:after="0"/>
             </w:pPr>
             <w:r>
               <w:rPr>
@@ -8893,16 +8893,16 @@
           <w:tcPr>
             <w:tcW w:type="dxa" w:w="3000"/>
             <w:tcMar>
-              <w:top w:type="dxa" w:w="35"/>
+              <w:top w:type="dxa" w:w="25"/>
               <w:left w:type="dxa" w:w="110"/>
-              <w:bottom w:type="dxa" w:w="45"/>
-              <w:right w:type="dxa" w:w="90"/>
-            </w:tcMar>
-            <w:vAlign w:val="top"/>
-          </w:tcPr>
-          <w:p>
-            <w:pPr>
-              <w:spacing w:after="10"/>
+              <w:bottom w:type="dxa" w:w="30"/>
+              <w:right w:type="dxa" w:w="90"/>
+            </w:tcMar>
+            <w:vAlign w:val="top"/>
+          </w:tcPr>
+          <w:p>
+            <w:pPr>
+              <w:spacing w:after="0"/>
             </w:pPr>
             <w:r>
               <w:rPr>
@@ -8938,16 +8938,16 @@
           <w:tcPr>
             <w:tcW w:type="dxa" w:w="3000"/>
             <w:tcMar>
-              <w:top w:type="dxa" w:w="35"/>
+              <w:top w:type="dxa" w:w="25"/>
               <w:left w:type="dxa" w:w="110"/>
-              <w:bottom w:type="dxa" w:w="45"/>
-              <w:right w:type="dxa" w:w="90"/>
-            </w:tcMar>
-            <w:vAlign w:val="top"/>
-          </w:tcPr>
-          <w:p>
-            <w:pPr>
-              <w:spacing w:after="10"/>
+              <w:bottom w:type="dxa" w:w="30"/>
+              <w:right w:type="dxa" w:w="90"/>
+            </w:tcMar>
+            <w:vAlign w:val="top"/>
+          </w:tcPr>
+          <w:p>
+            <w:pPr>
+              <w:spacing w:after="0"/>
             </w:pPr>
             <w:r>
               <w:rPr>
@@ -8983,16 +8983,16 @@
           <w:tcPr>
             <w:tcW w:type="dxa" w:w="3000"/>
             <w:tcMar>
-              <w:top w:type="dxa" w:w="35"/>
+              <w:top w:type="dxa" w:w="25"/>
               <w:left w:type="dxa" w:w="110"/>
-              <w:bottom w:type="dxa" w:w="45"/>
-              <w:right w:type="dxa" w:w="90"/>
-            </w:tcMar>
-            <w:vAlign w:val="top"/>
-          </w:tcPr>
-          <w:p>
-            <w:pPr>
-              <w:spacing w:after="10"/>
+              <w:bottom w:type="dxa" w:w="30"/>
+              <w:right w:type="dxa" w:w="90"/>
+            </w:tcMar>
+            <w:vAlign w:val="top"/>
+          </w:tcPr>
+          <w:p>
+            <w:pPr>
+              <w:spacing w:after="0"/>
             </w:pPr>
             <w:r>
               <w:rPr>
@@ -9028,7 +9028,7 @@
     </w:tbl>
     <w:p>
       <w:pPr>
-        <w:spacing w:after="40"/>
+        <w:spacing w:after="24"/>
       </w:pPr>
     </w:p>
     <w:tbl>
@@ -9057,9 +9057,9 @@
             <w:tcW w:type="dxa" w:w="3000"/>
             <w:shd w:fill="DBEFDE" w:color="auto" w:val="clear"/>
             <w:tcMar>
-              <w:top w:type="dxa" w:w="30"/>
+              <w:top w:type="dxa" w:w="20"/>
               <w:left w:type="dxa" w:w="110"/>
-              <w:bottom w:type="dxa" w:w="30"/>
+              <w:bottom w:type="dxa" w:w="20"/>
               <w:right w:type="dxa" w:w="90"/>
             </w:tcMar>
             <w:vAlign w:val="center"/>
@@ -9087,9 +9087,9 @@
             <w:gridSpan w:val="2"/>
             <w:shd w:fill="DBEFDE" w:color="auto" w:val="clear"/>
             <w:tcMar>
-              <w:top w:type="dxa" w:w="30"/>
+              <w:top w:type="dxa" w:w="20"/>
               <w:left w:type="dxa" w:w="110"/>
-              <w:bottom w:type="dxa" w:w="30"/>
+              <w:bottom w:type="dxa" w:w="20"/>
               <w:right w:type="dxa" w:w="90"/>
             </w:tcMar>
             <w:vAlign w:val="center"/>
@@ -9120,16 +9120,16 @@
           <w:tcPr>
             <w:tcW w:type="dxa" w:w="3000"/>
             <w:tcMar>
-              <w:top w:type="dxa" w:w="35"/>
+              <w:top w:type="dxa" w:w="25"/>
               <w:left w:type="dxa" w:w="110"/>
-              <w:bottom w:type="dxa" w:w="45"/>
-              <w:right w:type="dxa" w:w="90"/>
-            </w:tcMar>
-            <w:vAlign w:val="top"/>
-          </w:tcPr>
-          <w:p>
-            <w:pPr>
-              <w:spacing w:after="10"/>
+              <w:bottom w:type="dxa" w:w="30"/>
+              <w:right w:type="dxa" w:w="90"/>
+            </w:tcMar>
+            <w:vAlign w:val="top"/>
+          </w:tcPr>
+          <w:p>
+            <w:pPr>
+              <w:spacing w:after="0"/>
             </w:pPr>
             <w:r>
               <w:rPr>
@@ -9165,16 +9165,16 @@
           <w:tcPr>
             <w:tcW w:type="dxa" w:w="3000"/>
             <w:tcMar>
-              <w:top w:type="dxa" w:w="35"/>
+              <w:top w:type="dxa" w:w="25"/>
               <w:left w:type="dxa" w:w="110"/>
-              <w:bottom w:type="dxa" w:w="45"/>
-              <w:right w:type="dxa" w:w="90"/>
-            </w:tcMar>
-            <w:vAlign w:val="top"/>
-          </w:tcPr>
-          <w:p>
-            <w:pPr>
-              <w:spacing w:after="10"/>
+              <w:bottom w:type="dxa" w:w="30"/>
+              <w:right w:type="dxa" w:w="90"/>
+            </w:tcMar>
+            <w:vAlign w:val="top"/>
+          </w:tcPr>
+          <w:p>
+            <w:pPr>
+              <w:spacing w:after="0"/>
             </w:pPr>
             <w:r>
               <w:rPr>
@@ -9210,16 +9210,16 @@
           <w:tcPr>
             <w:tcW w:type="dxa" w:w="3000"/>
             <w:tcMar>
-              <w:top w:type="dxa" w:w="35"/>
+              <w:top w:type="dxa" w:w="25"/>
               <w:left w:type="dxa" w:w="110"/>
-              <w:bottom w:type="dxa" w:w="45"/>
-              <w:right w:type="dxa" w:w="90"/>
-            </w:tcMar>
-            <w:vAlign w:val="top"/>
-          </w:tcPr>
-          <w:p>
-            <w:pPr>
-              <w:spacing w:after="10"/>
+              <w:bottom w:type="dxa" w:w="30"/>
+              <w:right w:type="dxa" w:w="90"/>
+            </w:tcMar>
+            <w:vAlign w:val="top"/>
+          </w:tcPr>
+          <w:p>
+            <w:pPr>
+              <w:spacing w:after="0"/>
             </w:pPr>
             <w:r>
               <w:rPr>
@@ -9260,16 +9260,16 @@
           <w:tcPr>
             <w:tcW w:type="dxa" w:w="3000"/>
             <w:tcMar>
-              <w:top w:type="dxa" w:w="35"/>
+              <w:top w:type="dxa" w:w="25"/>
               <w:left w:type="dxa" w:w="110"/>
-              <w:bottom w:type="dxa" w:w="45"/>
-              <w:right w:type="dxa" w:w="90"/>
-            </w:tcMar>
-            <w:vAlign w:val="top"/>
-          </w:tcPr>
-          <w:p>
-            <w:pPr>
-              <w:spacing w:after="10"/>
+              <w:bottom w:type="dxa" w:w="30"/>
+              <w:right w:type="dxa" w:w="90"/>
+            </w:tcMar>
+            <w:vAlign w:val="top"/>
+          </w:tcPr>
+          <w:p>
+            <w:pPr>
+              <w:spacing w:after="0"/>
             </w:pPr>
             <w:r>
               <w:rPr>
@@ -9305,16 +9305,16 @@
           <w:tcPr>
             <w:tcW w:type="dxa" w:w="3000"/>
             <w:tcMar>
-              <w:top w:type="dxa" w:w="35"/>
+              <w:top w:type="dxa" w:w="25"/>
               <w:left w:type="dxa" w:w="110"/>
-              <w:bottom w:type="dxa" w:w="45"/>
-              <w:right w:type="dxa" w:w="90"/>
-            </w:tcMar>
-            <w:vAlign w:val="top"/>
-          </w:tcPr>
-          <w:p>
-            <w:pPr>
-              <w:spacing w:after="10"/>
+              <w:bottom w:type="dxa" w:w="30"/>
+              <w:right w:type="dxa" w:w="90"/>
+            </w:tcMar>
+            <w:vAlign w:val="top"/>
+          </w:tcPr>
+          <w:p>
+            <w:pPr>
+              <w:spacing w:after="0"/>
             </w:pPr>
             <w:r>
               <w:rPr>
@@ -9350,16 +9350,16 @@
           <w:tcPr>
             <w:tcW w:type="dxa" w:w="3000"/>
             <w:tcMar>
-              <w:top w:type="dxa" w:w="35"/>
+              <w:top w:type="dxa" w:w="25"/>
               <w:left w:type="dxa" w:w="110"/>
-              <w:bottom w:type="dxa" w:w="45"/>
-              <w:right w:type="dxa" w:w="90"/>
-            </w:tcMar>
-            <w:vAlign w:val="top"/>
-          </w:tcPr>
-          <w:p>
-            <w:pPr>
-              <w:spacing w:after="10"/>
+              <w:bottom w:type="dxa" w:w="30"/>
+              <w:right w:type="dxa" w:w="90"/>
+            </w:tcMar>
+            <w:vAlign w:val="top"/>
+          </w:tcPr>
+          <w:p>
+            <w:pPr>
+              <w:spacing w:after="0"/>
             </w:pPr>
             <w:r>
               <w:rPr>
@@ -9395,7 +9395,7 @@
     </w:tbl>
     <w:p>
       <w:pPr>
-        <w:spacing w:after="40"/>
+        <w:spacing w:after="24"/>
       </w:pPr>
     </w:p>
     <w:tbl>
@@ -9424,9 +9424,9 @@
             <w:tcW w:type="dxa" w:w="3000"/>
             <w:shd w:fill="DBEFDE" w:color="auto" w:val="clear"/>
             <w:tcMar>
-              <w:top w:type="dxa" w:w="30"/>
+              <w:top w:type="dxa" w:w="20"/>
               <w:left w:type="dxa" w:w="110"/>
-              <w:bottom w:type="dxa" w:w="30"/>
+              <w:bottom w:type="dxa" w:w="20"/>
               <w:right w:type="dxa" w:w="90"/>
             </w:tcMar>
             <w:vAlign w:val="center"/>
@@ -9454,9 +9454,9 @@
             <w:gridSpan w:val="2"/>
             <w:shd w:fill="DBEFDE" w:color="auto" w:val="clear"/>
             <w:tcMar>
-              <w:top w:type="dxa" w:w="30"/>
+              <w:top w:type="dxa" w:w="20"/>
               <w:left w:type="dxa" w:w="110"/>
-              <w:bottom w:type="dxa" w:w="30"/>
+              <w:bottom w:type="dxa" w:w="20"/>
               <w:right w:type="dxa" w:w="90"/>
             </w:tcMar>
             <w:vAlign w:val="center"/>
@@ -9487,16 +9487,16 @@
           <w:tcPr>
             <w:tcW w:type="dxa" w:w="3000"/>
             <w:tcMar>
-              <w:top w:type="dxa" w:w="35"/>
+              <w:top w:type="dxa" w:w="25"/>
               <w:left w:type="dxa" w:w="110"/>
-              <w:bottom w:type="dxa" w:w="45"/>
-              <w:right w:type="dxa" w:w="90"/>
-            </w:tcMar>
-            <w:vAlign w:val="top"/>
-          </w:tcPr>
-          <w:p>
-            <w:pPr>
-              <w:spacing w:after="10"/>
+              <w:bottom w:type="dxa" w:w="30"/>
+              <w:right w:type="dxa" w:w="90"/>
+            </w:tcMar>
+            <w:vAlign w:val="top"/>
+          </w:tcPr>
+          <w:p>
+            <w:pPr>
+              <w:spacing w:after="0"/>
             </w:pPr>
             <w:r>
               <w:rPr>
@@ -9532,16 +9532,16 @@
           <w:tcPr>
             <w:tcW w:type="dxa" w:w="3000"/>
             <w:tcMar>
-              <w:top w:type="dxa" w:w="35"/>
+              <w:top w:type="dxa" w:w="25"/>
               <w:left w:type="dxa" w:w="110"/>
-              <w:bottom w:type="dxa" w:w="45"/>
-              <w:right w:type="dxa" w:w="90"/>
-            </w:tcMar>
-            <w:vAlign w:val="top"/>
-          </w:tcPr>
-          <w:p>
-            <w:pPr>
-              <w:spacing w:after="10"/>
+              <w:bottom w:type="dxa" w:w="30"/>
+              <w:right w:type="dxa" w:w="90"/>
+            </w:tcMar>
+            <w:vAlign w:val="top"/>
+          </w:tcPr>
+          <w:p>
+            <w:pPr>
+              <w:spacing w:after="0"/>
             </w:pPr>
             <w:r>
               <w:rPr>
@@ -9577,16 +9577,16 @@
           <w:tcPr>
             <w:tcW w:type="dxa" w:w="3000"/>
             <w:tcMar>
-              <w:top w:type="dxa" w:w="35"/>
+              <w:top w:type="dxa" w:w="25"/>
               <w:left w:type="dxa" w:w="110"/>
-              <w:bottom w:type="dxa" w:w="45"/>
-              <w:right w:type="dxa" w:w="90"/>
-            </w:tcMar>
-            <w:vAlign w:val="top"/>
-          </w:tcPr>
-          <w:p>
-            <w:pPr>
-              <w:spacing w:after="10"/>
+              <w:bottom w:type="dxa" w:w="30"/>
+              <w:right w:type="dxa" w:w="90"/>
+            </w:tcMar>
+            <w:vAlign w:val="top"/>
+          </w:tcPr>
+          <w:p>
+            <w:pPr>
+              <w:spacing w:after="0"/>
             </w:pPr>
             <w:r>
               <w:rPr>
@@ -9627,16 +9627,16 @@
           <w:tcPr>
             <w:tcW w:type="dxa" w:w="3000"/>
             <w:tcMar>
-              <w:top w:type="dxa" w:w="35"/>
+              <w:top w:type="dxa" w:w="25"/>
               <w:left w:type="dxa" w:w="110"/>
-              <w:bottom w:type="dxa" w:w="45"/>
-              <w:right w:type="dxa" w:w="90"/>
-            </w:tcMar>
-            <w:vAlign w:val="top"/>
-          </w:tcPr>
-          <w:p>
-            <w:pPr>
-              <w:spacing w:after="10"/>
+              <w:bottom w:type="dxa" w:w="30"/>
+              <w:right w:type="dxa" w:w="90"/>
+            </w:tcMar>
+            <w:vAlign w:val="top"/>
+          </w:tcPr>
+          <w:p>
+            <w:pPr>
+              <w:spacing w:after="0"/>
             </w:pPr>
             <w:r>
               <w:rPr>
@@ -9672,16 +9672,16 @@
           <w:tcPr>
             <w:tcW w:type="dxa" w:w="3000"/>
             <w:tcMar>
-              <w:top w:type="dxa" w:w="35"/>
+              <w:top w:type="dxa" w:w="25"/>
               <w:left w:type="dxa" w:w="110"/>
-              <w:bottom w:type="dxa" w:w="45"/>
-              <w:right w:type="dxa" w:w="90"/>
-            </w:tcMar>
-            <w:vAlign w:val="top"/>
-          </w:tcPr>
-          <w:p>
-            <w:pPr>
-              <w:spacing w:after="10"/>
+              <w:bottom w:type="dxa" w:w="30"/>
+              <w:right w:type="dxa" w:w="90"/>
+            </w:tcMar>
+            <w:vAlign w:val="top"/>
+          </w:tcPr>
+          <w:p>
+            <w:pPr>
+              <w:spacing w:after="0"/>
             </w:pPr>
             <w:r>
               <w:rPr>
@@ -9717,16 +9717,16 @@
           <w:tcPr>
             <w:tcW w:type="dxa" w:w="3000"/>
             <w:tcMar>
-              <w:top w:type="dxa" w:w="35"/>
+              <w:top w:type="dxa" w:w="25"/>
               <w:left w:type="dxa" w:w="110"/>
-              <w:bottom w:type="dxa" w:w="45"/>
-              <w:right w:type="dxa" w:w="90"/>
-            </w:tcMar>
-            <w:vAlign w:val="top"/>
-          </w:tcPr>
-          <w:p>
-            <w:pPr>
-              <w:spacing w:after="10"/>
+              <w:bottom w:type="dxa" w:w="30"/>
+              <w:right w:type="dxa" w:w="90"/>
+            </w:tcMar>
+            <w:vAlign w:val="top"/>
+          </w:tcPr>
+          <w:p>
+            <w:pPr>
+              <w:spacing w:after="0"/>
             </w:pPr>
             <w:r>
               <w:rPr>
@@ -9762,7 +9762,7 @@
     </w:tbl>
     <w:p>
       <w:pPr>
-        <w:spacing w:after="40"/>
+        <w:spacing w:after="24"/>
       </w:pPr>
     </w:p>
     <w:tbl>
@@ -9791,9 +9791,9 @@
             <w:tcW w:type="dxa" w:w="3000"/>
             <w:shd w:fill="DBEFDE" w:color="auto" w:val="clear"/>
             <w:tcMar>
-              <w:top w:type="dxa" w:w="30"/>
+              <w:top w:type="dxa" w:w="20"/>
               <w:left w:type="dxa" w:w="110"/>
-              <w:bottom w:type="dxa" w:w="30"/>
+              <w:bottom w:type="dxa" w:w="20"/>
               <w:right w:type="dxa" w:w="90"/>
             </w:tcMar>
             <w:vAlign w:val="center"/>
@@ -9821,9 +9821,9 @@
             <w:gridSpan w:val="2"/>
             <w:shd w:fill="DBEFDE" w:color="auto" w:val="clear"/>
             <w:tcMar>
-              <w:top w:type="dxa" w:w="30"/>
+              <w:top w:type="dxa" w:w="20"/>
               <w:left w:type="dxa" w:w="110"/>
-              <w:bottom w:type="dxa" w:w="30"/>
+              <w:bottom w:type="dxa" w:w="20"/>
               <w:right w:type="dxa" w:w="90"/>
             </w:tcMar>
             <w:vAlign w:val="center"/>
@@ -9854,16 +9854,16 @@
           <w:tcPr>
             <w:tcW w:type="dxa" w:w="3000"/>
             <w:tcMar>
-              <w:top w:type="dxa" w:w="35"/>
+              <w:top w:type="dxa" w:w="25"/>
               <w:left w:type="dxa" w:w="110"/>
-              <w:bottom w:type="dxa" w:w="45"/>
-              <w:right w:type="dxa" w:w="90"/>
-            </w:tcMar>
-            <w:vAlign w:val="top"/>
-          </w:tcPr>
-          <w:p>
-            <w:pPr>
-              <w:spacing w:after="10"/>
+              <w:bottom w:type="dxa" w:w="30"/>
+              <w:right w:type="dxa" w:w="90"/>
+            </w:tcMar>
+            <w:vAlign w:val="top"/>
+          </w:tcPr>
+          <w:p>
+            <w:pPr>
+              <w:spacing w:after="0"/>
             </w:pPr>
             <w:r>
               <w:rPr>
@@ -9899,16 +9899,16 @@
           <w:tcPr>
             <w:tcW w:type="dxa" w:w="3000"/>
             <w:tcMar>
-              <w:top w:type="dxa" w:w="35"/>
+              <w:top w:type="dxa" w:w="25"/>
               <w:left w:type="dxa" w:w="110"/>
-              <w:bottom w:type="dxa" w:w="45"/>
-              <w:right w:type="dxa" w:w="90"/>
-            </w:tcMar>
-            <w:vAlign w:val="top"/>
-          </w:tcPr>
-          <w:p>
-            <w:pPr>
-              <w:spacing w:after="10"/>
+              <w:bottom w:type="dxa" w:w="30"/>
+              <w:right w:type="dxa" w:w="90"/>
+            </w:tcMar>
+            <w:vAlign w:val="top"/>
+          </w:tcPr>
+          <w:p>
+            <w:pPr>
+              <w:spacing w:after="0"/>
             </w:pPr>
             <w:r>
               <w:rPr>
@@ -9944,16 +9944,16 @@
           <w:tcPr>
             <w:tcW w:type="dxa" w:w="3000"/>
             <w:tcMar>
-              <w:top w:type="dxa" w:w="35"/>
+              <w:top w:type="dxa" w:w="25"/>
               <w:left w:type="dxa" w:w="110"/>
-              <w:bottom w:type="dxa" w:w="45"/>
-              <w:right w:type="dxa" w:w="90"/>
-            </w:tcMar>
-            <w:vAlign w:val="top"/>
-          </w:tcPr>
-          <w:p>
-            <w:pPr>
-              <w:spacing w:after="10"/>
+              <w:bottom w:type="dxa" w:w="30"/>
+              <w:right w:type="dxa" w:w="90"/>
+            </w:tcMar>
+            <w:vAlign w:val="top"/>
+          </w:tcPr>
+          <w:p>
+            <w:pPr>
+              <w:spacing w:after="0"/>
             </w:pPr>
             <w:r>
               <w:rPr>
@@ -9994,16 +9994,16 @@
           <w:tcPr>
             <w:tcW w:type="dxa" w:w="3000"/>
             <w:tcMar>
-              <w:top w:type="dxa" w:w="35"/>
+              <w:top w:type="dxa" w:w="25"/>
               <w:left w:type="dxa" w:w="110"/>
-              <w:bottom w:type="dxa" w:w="45"/>
-              <w:right w:type="dxa" w:w="90"/>
-            </w:tcMar>
-            <w:vAlign w:val="top"/>
-          </w:tcPr>
-          <w:p>
-            <w:pPr>
-              <w:spacing w:after="10"/>
+              <w:bottom w:type="dxa" w:w="30"/>
+              <w:right w:type="dxa" w:w="90"/>
+            </w:tcMar>
+            <w:vAlign w:val="top"/>
+          </w:tcPr>
+          <w:p>
+            <w:pPr>
+              <w:spacing w:after="0"/>
             </w:pPr>
             <w:r>
               <w:rPr>
@@ -10039,16 +10039,16 @@
           <w:tcPr>
             <w:tcW w:type="dxa" w:w="3000"/>
             <w:tcMar>
-              <w:top w:type="dxa" w:w="35"/>
+              <w:top w:type="dxa" w:w="25"/>
               <w:left w:type="dxa" w:w="110"/>
-              <w:bottom w:type="dxa" w:w="45"/>
-              <w:right w:type="dxa" w:w="90"/>
-            </w:tcMar>
-            <w:vAlign w:val="top"/>
-          </w:tcPr>
-          <w:p>
-            <w:pPr>
-              <w:spacing w:after="10"/>
+              <w:bottom w:type="dxa" w:w="30"/>
+              <w:right w:type="dxa" w:w="90"/>
+            </w:tcMar>
+            <w:vAlign w:val="top"/>
+          </w:tcPr>
+          <w:p>
+            <w:pPr>
+              <w:spacing w:after="0"/>
             </w:pPr>
             <w:r>
               <w:rPr>
@@ -10084,16 +10084,16 @@
           <w:tcPr>
             <w:tcW w:type="dxa" w:w="3000"/>
             <w:tcMar>
-              <w:top w:type="dxa" w:w="35"/>
+              <w:top w:type="dxa" w:w="25"/>
               <w:left w:type="dxa" w:w="110"/>
-              <w:bottom w:type="dxa" w:w="45"/>
-              <w:right w:type="dxa" w:w="90"/>
-            </w:tcMar>
-            <w:vAlign w:val="top"/>
-          </w:tcPr>
-          <w:p>
-            <w:pPr>
-              <w:spacing w:after="10"/>
+              <w:bottom w:type="dxa" w:w="30"/>
+              <w:right w:type="dxa" w:w="90"/>
+            </w:tcMar>
+            <w:vAlign w:val="top"/>
+          </w:tcPr>
+          <w:p>
+            <w:pPr>
+              <w:spacing w:after="0"/>
             </w:pPr>
             <w:r>
               <w:rPr>
@@ -10252,7 +10252,7 @@
           <w:sz w:val="18"/>
           <w:szCs w:val="18"/>
         </w:rPr>
-        <w:t xml:space="preserve">Later faults: two values, other sectors, a REFERENCE that points on, or TIME-CRITICAL. "ASK MED → …": the Liaison asks Medical for that reference; the answer is a number or a sector's name to follow.</w:t>
+        <w:t xml:space="preserve">Later faults: two or three values, other sectors, a REFERENCE that points on, or TIME-CRITICAL. "ASK MED → …": the Liaison asks Medical for that reference; the answer is a number or a sector's name to follow.</w:t>
       </w:r>
     </w:p>
     <w:tbl>
@@ -10281,9 +10281,9 @@
             <w:tcW w:type="dxa" w:w="3000"/>
             <w:shd w:fill="DBEFDE" w:color="auto" w:val="clear"/>
             <w:tcMar>
-              <w:top w:type="dxa" w:w="30"/>
+              <w:top w:type="dxa" w:w="20"/>
               <w:left w:type="dxa" w:w="110"/>
-              <w:bottom w:type="dxa" w:w="30"/>
+              <w:bottom w:type="dxa" w:w="20"/>
               <w:right w:type="dxa" w:w="90"/>
             </w:tcMar>
             <w:vAlign w:val="center"/>
@@ -10311,9 +10311,9 @@
             <w:gridSpan w:val="2"/>
             <w:shd w:fill="DBEFDE" w:color="auto" w:val="clear"/>
             <w:tcMar>
-              <w:top w:type="dxa" w:w="30"/>
+              <w:top w:type="dxa" w:w="20"/>
               <w:left w:type="dxa" w:w="110"/>
-              <w:bottom w:type="dxa" w:w="30"/>
+              <w:bottom w:type="dxa" w:w="20"/>
               <w:right w:type="dxa" w:w="90"/>
             </w:tcMar>
             <w:vAlign w:val="center"/>
@@ -10344,16 +10344,16 @@
           <w:tcPr>
             <w:tcW w:type="dxa" w:w="3000"/>
             <w:tcMar>
-              <w:top w:type="dxa" w:w="35"/>
+              <w:top w:type="dxa" w:w="25"/>
               <w:left w:type="dxa" w:w="110"/>
-              <w:bottom w:type="dxa" w:w="45"/>
-              <w:right w:type="dxa" w:w="90"/>
-            </w:tcMar>
-            <w:vAlign w:val="top"/>
-          </w:tcPr>
-          <w:p>
-            <w:pPr>
-              <w:spacing w:after="10"/>
+              <w:bottom w:type="dxa" w:w="30"/>
+              <w:right w:type="dxa" w:w="90"/>
+            </w:tcMar>
+            <w:vAlign w:val="top"/>
+          </w:tcPr>
+          <w:p>
+            <w:pPr>
+              <w:spacing w:after="0"/>
             </w:pPr>
             <w:r>
               <w:rPr>
@@ -10389,16 +10389,16 @@
           <w:tcPr>
             <w:tcW w:type="dxa" w:w="3000"/>
             <w:tcMar>
-              <w:top w:type="dxa" w:w="35"/>
+              <w:top w:type="dxa" w:w="25"/>
               <w:left w:type="dxa" w:w="110"/>
-              <w:bottom w:type="dxa" w:w="45"/>
-              <w:right w:type="dxa" w:w="90"/>
-            </w:tcMar>
-            <w:vAlign w:val="top"/>
-          </w:tcPr>
-          <w:p>
-            <w:pPr>
-              <w:spacing w:after="10"/>
+              <w:bottom w:type="dxa" w:w="30"/>
+              <w:right w:type="dxa" w:w="90"/>
+            </w:tcMar>
+            <w:vAlign w:val="top"/>
+          </w:tcPr>
+          <w:p>
+            <w:pPr>
+              <w:spacing w:after="0"/>
             </w:pPr>
             <w:r>
               <w:rPr>
@@ -10434,16 +10434,16 @@
           <w:tcPr>
             <w:tcW w:type="dxa" w:w="3000"/>
             <w:tcMar>
-              <w:top w:type="dxa" w:w="35"/>
+              <w:top w:type="dxa" w:w="25"/>
               <w:left w:type="dxa" w:w="110"/>
-              <w:bottom w:type="dxa" w:w="45"/>
-              <w:right w:type="dxa" w:w="90"/>
-            </w:tcMar>
-            <w:vAlign w:val="top"/>
-          </w:tcPr>
-          <w:p>
-            <w:pPr>
-              <w:spacing w:after="10"/>
+              <w:bottom w:type="dxa" w:w="30"/>
+              <w:right w:type="dxa" w:w="90"/>
+            </w:tcMar>
+            <w:vAlign w:val="top"/>
+          </w:tcPr>
+          <w:p>
+            <w:pPr>
+              <w:spacing w:after="0"/>
             </w:pPr>
             <w:r>
               <w:rPr>
@@ -10484,16 +10484,16 @@
           <w:tcPr>
             <w:tcW w:type="dxa" w:w="3000"/>
             <w:tcMar>
-              <w:top w:type="dxa" w:w="35"/>
+              <w:top w:type="dxa" w:w="25"/>
               <w:left w:type="dxa" w:w="110"/>
-              <w:bottom w:type="dxa" w:w="45"/>
-              <w:right w:type="dxa" w:w="90"/>
-            </w:tcMar>
-            <w:vAlign w:val="top"/>
-          </w:tcPr>
-          <w:p>
-            <w:pPr>
-              <w:spacing w:after="10"/>
+              <w:bottom w:type="dxa" w:w="30"/>
+              <w:right w:type="dxa" w:w="90"/>
+            </w:tcMar>
+            <w:vAlign w:val="top"/>
+          </w:tcPr>
+          <w:p>
+            <w:pPr>
+              <w:spacing w:after="0"/>
             </w:pPr>
             <w:r>
               <w:rPr>
@@ -10529,16 +10529,16 @@
           <w:tcPr>
             <w:tcW w:type="dxa" w:w="3000"/>
             <w:tcMar>
-              <w:top w:type="dxa" w:w="35"/>
+              <w:top w:type="dxa" w:w="25"/>
               <w:left w:type="dxa" w:w="110"/>
-              <w:bottom w:type="dxa" w:w="45"/>
-              <w:right w:type="dxa" w:w="90"/>
-            </w:tcMar>
-            <w:vAlign w:val="top"/>
-          </w:tcPr>
-          <w:p>
-            <w:pPr>
-              <w:spacing w:after="10"/>
+              <w:bottom w:type="dxa" w:w="30"/>
+              <w:right w:type="dxa" w:w="90"/>
+            </w:tcMar>
+            <w:vAlign w:val="top"/>
+          </w:tcPr>
+          <w:p>
+            <w:pPr>
+              <w:spacing w:after="0"/>
             </w:pPr>
             <w:r>
               <w:rPr>
@@ -10574,16 +10574,16 @@
           <w:tcPr>
             <w:tcW w:type="dxa" w:w="3000"/>
             <w:tcMar>
-              <w:top w:type="dxa" w:w="35"/>
+              <w:top w:type="dxa" w:w="25"/>
               <w:left w:type="dxa" w:w="110"/>
-              <w:bottom w:type="dxa" w:w="45"/>
-              <w:right w:type="dxa" w:w="90"/>
-            </w:tcMar>
-            <w:vAlign w:val="top"/>
-          </w:tcPr>
-          <w:p>
-            <w:pPr>
-              <w:spacing w:after="10"/>
+              <w:bottom w:type="dxa" w:w="30"/>
+              <w:right w:type="dxa" w:w="90"/>
+            </w:tcMar>
+            <w:vAlign w:val="top"/>
+          </w:tcPr>
+          <w:p>
+            <w:pPr>
+              <w:spacing w:after="0"/>
             </w:pPr>
             <w:r>
               <w:rPr>
@@ -10619,7 +10619,7 @@
     </w:tbl>
     <w:p>
       <w:pPr>
-        <w:spacing w:after="40"/>
+        <w:spacing w:after="24"/>
       </w:pPr>
     </w:p>
     <w:tbl>
@@ -10648,9 +10648,9 @@
             <w:tcW w:type="dxa" w:w="3000"/>
             <w:shd w:fill="DBEFDE" w:color="auto" w:val="clear"/>
             <w:tcMar>
-              <w:top w:type="dxa" w:w="30"/>
+              <w:top w:type="dxa" w:w="20"/>
               <w:left w:type="dxa" w:w="110"/>
-              <w:bottom w:type="dxa" w:w="30"/>
+              <w:bottom w:type="dxa" w:w="20"/>
               <w:right w:type="dxa" w:w="90"/>
             </w:tcMar>
             <w:vAlign w:val="center"/>
@@ -10678,9 +10678,9 @@
             <w:gridSpan w:val="2"/>
             <w:shd w:fill="DBEFDE" w:color="auto" w:val="clear"/>
             <w:tcMar>
-              <w:top w:type="dxa" w:w="30"/>
+              <w:top w:type="dxa" w:w="20"/>
               <w:left w:type="dxa" w:w="110"/>
-              <w:bottom w:type="dxa" w:w="30"/>
+              <w:bottom w:type="dxa" w:w="20"/>
               <w:right w:type="dxa" w:w="90"/>
             </w:tcMar>
             <w:vAlign w:val="center"/>
@@ -10711,16 +10711,16 @@
           <w:tcPr>
             <w:tcW w:type="dxa" w:w="3000"/>
             <w:tcMar>
-              <w:top w:type="dxa" w:w="35"/>
+              <w:top w:type="dxa" w:w="25"/>
               <w:left w:type="dxa" w:w="110"/>
-              <w:bottom w:type="dxa" w:w="45"/>
-              <w:right w:type="dxa" w:w="90"/>
-            </w:tcMar>
-            <w:vAlign w:val="top"/>
-          </w:tcPr>
-          <w:p>
-            <w:pPr>
-              <w:spacing w:after="10"/>
+              <w:bottom w:type="dxa" w:w="30"/>
+              <w:right w:type="dxa" w:w="90"/>
+            </w:tcMar>
+            <w:vAlign w:val="top"/>
+          </w:tcPr>
+          <w:p>
+            <w:pPr>
+              <w:spacing w:after="0"/>
             </w:pPr>
             <w:r>
               <w:rPr>
@@ -10756,16 +10756,16 @@
           <w:tcPr>
             <w:tcW w:type="dxa" w:w="3000"/>
             <w:tcMar>
-              <w:top w:type="dxa" w:w="35"/>
+              <w:top w:type="dxa" w:w="25"/>
               <w:left w:type="dxa" w:w="110"/>
-              <w:bottom w:type="dxa" w:w="45"/>
-              <w:right w:type="dxa" w:w="90"/>
-            </w:tcMar>
-            <w:vAlign w:val="top"/>
-          </w:tcPr>
-          <w:p>
-            <w:pPr>
-              <w:spacing w:after="10"/>
+              <w:bottom w:type="dxa" w:w="30"/>
+              <w:right w:type="dxa" w:w="90"/>
+            </w:tcMar>
+            <w:vAlign w:val="top"/>
+          </w:tcPr>
+          <w:p>
+            <w:pPr>
+              <w:spacing w:after="0"/>
             </w:pPr>
             <w:r>
               <w:rPr>
@@ -10801,16 +10801,16 @@
           <w:tcPr>
             <w:tcW w:type="dxa" w:w="3000"/>
             <w:tcMar>
-              <w:top w:type="dxa" w:w="35"/>
+              <w:top w:type="dxa" w:w="25"/>
               <w:left w:type="dxa" w:w="110"/>
-              <w:bottom w:type="dxa" w:w="45"/>
-              <w:right w:type="dxa" w:w="90"/>
-            </w:tcMar>
-            <w:vAlign w:val="top"/>
-          </w:tcPr>
-          <w:p>
-            <w:pPr>
-              <w:spacing w:after="10"/>
+              <w:bottom w:type="dxa" w:w="30"/>
+              <w:right w:type="dxa" w:w="90"/>
+            </w:tcMar>
+            <w:vAlign w:val="top"/>
+          </w:tcPr>
+          <w:p>
+            <w:pPr>
+              <w:spacing w:after="0"/>
             </w:pPr>
             <w:r>
               <w:rPr>
@@ -10851,16 +10851,16 @@
           <w:tcPr>
             <w:tcW w:type="dxa" w:w="3000"/>
             <w:tcMar>
-              <w:top w:type="dxa" w:w="35"/>
+              <w:top w:type="dxa" w:w="25"/>
               <w:left w:type="dxa" w:w="110"/>
-              <w:bottom w:type="dxa" w:w="45"/>
-              <w:right w:type="dxa" w:w="90"/>
-            </w:tcMar>
-            <w:vAlign w:val="top"/>
-          </w:tcPr>
-          <w:p>
-            <w:pPr>
-              <w:spacing w:after="10"/>
+              <w:bottom w:type="dxa" w:w="30"/>
+              <w:right w:type="dxa" w:w="90"/>
+            </w:tcMar>
+            <w:vAlign w:val="top"/>
+          </w:tcPr>
+          <w:p>
+            <w:pPr>
+              <w:spacing w:after="0"/>
             </w:pPr>
             <w:r>
               <w:rPr>
@@ -10912,16 +10912,16 @@
           <w:tcPr>
             <w:tcW w:type="dxa" w:w="3000"/>
             <w:tcMar>
-              <w:top w:type="dxa" w:w="35"/>
+              <w:top w:type="dxa" w:w="25"/>
               <w:left w:type="dxa" w:w="110"/>
-              <w:bottom w:type="dxa" w:w="45"/>
-              <w:right w:type="dxa" w:w="90"/>
-            </w:tcMar>
-            <w:vAlign w:val="top"/>
-          </w:tcPr>
-          <w:p>
-            <w:pPr>
-              <w:spacing w:after="10"/>
+              <w:bottom w:type="dxa" w:w="30"/>
+              <w:right w:type="dxa" w:w="90"/>
+            </w:tcMar>
+            <w:vAlign w:val="top"/>
+          </w:tcPr>
+          <w:p>
+            <w:pPr>
+              <w:spacing w:after="0"/>
             </w:pPr>
             <w:r>
               <w:rPr>
@@ -10957,16 +10957,16 @@
           <w:tcPr>
             <w:tcW w:type="dxa" w:w="3000"/>
             <w:tcMar>
-              <w:top w:type="dxa" w:w="35"/>
+              <w:top w:type="dxa" w:w="25"/>
               <w:left w:type="dxa" w:w="110"/>
-              <w:bottom w:type="dxa" w:w="45"/>
-              <w:right w:type="dxa" w:w="90"/>
-            </w:tcMar>
-            <w:vAlign w:val="top"/>
-          </w:tcPr>
-          <w:p>
-            <w:pPr>
-              <w:spacing w:after="10"/>
+              <w:bottom w:type="dxa" w:w="30"/>
+              <w:right w:type="dxa" w:w="90"/>
+            </w:tcMar>
+            <w:vAlign w:val="top"/>
+          </w:tcPr>
+          <w:p>
+            <w:pPr>
+              <w:spacing w:after="0"/>
             </w:pPr>
             <w:r>
               <w:rPr>
@@ -11002,7 +11002,7 @@
     </w:tbl>
     <w:p>
       <w:pPr>
-        <w:spacing w:after="40"/>
+        <w:spacing w:after="24"/>
       </w:pPr>
     </w:p>
     <w:tbl>
@@ -11031,9 +11031,9 @@
             <w:tcW w:type="dxa" w:w="3000"/>
             <w:shd w:fill="DBEFDE" w:color="auto" w:val="clear"/>
             <w:tcMar>
-              <w:top w:type="dxa" w:w="30"/>
+              <w:top w:type="dxa" w:w="20"/>
               <w:left w:type="dxa" w:w="110"/>
-              <w:bottom w:type="dxa" w:w="30"/>
+              <w:bottom w:type="dxa" w:w="20"/>
               <w:right w:type="dxa" w:w="90"/>
             </w:tcMar>
             <w:vAlign w:val="center"/>
@@ -11061,9 +11061,9 @@
             <w:gridSpan w:val="2"/>
             <w:shd w:fill="DBEFDE" w:color="auto" w:val="clear"/>
             <w:tcMar>
-              <w:top w:type="dxa" w:w="30"/>
+              <w:top w:type="dxa" w:w="20"/>
               <w:left w:type="dxa" w:w="110"/>
-              <w:bottom w:type="dxa" w:w="30"/>
+              <w:bottom w:type="dxa" w:w="20"/>
               <w:right w:type="dxa" w:w="90"/>
             </w:tcMar>
             <w:vAlign w:val="center"/>
@@ -11094,16 +11094,16 @@
           <w:tcPr>
             <w:tcW w:type="dxa" w:w="3000"/>
             <w:tcMar>
-              <w:top w:type="dxa" w:w="35"/>
+              <w:top w:type="dxa" w:w="25"/>
               <w:left w:type="dxa" w:w="110"/>
-              <w:bottom w:type="dxa" w:w="45"/>
-              <w:right w:type="dxa" w:w="90"/>
-            </w:tcMar>
-            <w:vAlign w:val="top"/>
-          </w:tcPr>
-          <w:p>
-            <w:pPr>
-              <w:spacing w:after="10"/>
+              <w:bottom w:type="dxa" w:w="30"/>
+              <w:right w:type="dxa" w:w="90"/>
+            </w:tcMar>
+            <w:vAlign w:val="top"/>
+          </w:tcPr>
+          <w:p>
+            <w:pPr>
+              <w:spacing w:after="0"/>
             </w:pPr>
             <w:r>
               <w:rPr>
@@ -11139,16 +11139,16 @@
           <w:tcPr>
             <w:tcW w:type="dxa" w:w="3000"/>
             <w:tcMar>
-              <w:top w:type="dxa" w:w="35"/>
+              <w:top w:type="dxa" w:w="25"/>
               <w:left w:type="dxa" w:w="110"/>
-              <w:bottom w:type="dxa" w:w="45"/>
-              <w:right w:type="dxa" w:w="90"/>
-            </w:tcMar>
-            <w:vAlign w:val="top"/>
-          </w:tcPr>
-          <w:p>
-            <w:pPr>
-              <w:spacing w:after="10"/>
+              <w:bottom w:type="dxa" w:w="30"/>
+              <w:right w:type="dxa" w:w="90"/>
+            </w:tcMar>
+            <w:vAlign w:val="top"/>
+          </w:tcPr>
+          <w:p>
+            <w:pPr>
+              <w:spacing w:after="0"/>
             </w:pPr>
             <w:r>
               <w:rPr>
@@ -11184,16 +11184,16 @@
           <w:tcPr>
             <w:tcW w:type="dxa" w:w="3000"/>
             <w:tcMar>
-              <w:top w:type="dxa" w:w="35"/>
+              <w:top w:type="dxa" w:w="25"/>
               <w:left w:type="dxa" w:w="110"/>
-              <w:bottom w:type="dxa" w:w="45"/>
-              <w:right w:type="dxa" w:w="90"/>
-            </w:tcMar>
-            <w:vAlign w:val="top"/>
-          </w:tcPr>
-          <w:p>
-            <w:pPr>
-              <w:spacing w:after="10"/>
+              <w:bottom w:type="dxa" w:w="30"/>
+              <w:right w:type="dxa" w:w="90"/>
+            </w:tcMar>
+            <w:vAlign w:val="top"/>
+          </w:tcPr>
+          <w:p>
+            <w:pPr>
+              <w:spacing w:after="0"/>
             </w:pPr>
             <w:r>
               <w:rPr>
@@ -11234,16 +11234,16 @@
           <w:tcPr>
             <w:tcW w:type="dxa" w:w="3000"/>
             <w:tcMar>
-              <w:top w:type="dxa" w:w="35"/>
+              <w:top w:type="dxa" w:w="25"/>
               <w:left w:type="dxa" w:w="110"/>
-              <w:bottom w:type="dxa" w:w="45"/>
-              <w:right w:type="dxa" w:w="90"/>
-            </w:tcMar>
-            <w:vAlign w:val="top"/>
-          </w:tcPr>
-          <w:p>
-            <w:pPr>
-              <w:spacing w:after="10"/>
+              <w:bottom w:type="dxa" w:w="30"/>
+              <w:right w:type="dxa" w:w="90"/>
+            </w:tcMar>
+            <w:vAlign w:val="top"/>
+          </w:tcPr>
+          <w:p>
+            <w:pPr>
+              <w:spacing w:after="0"/>
             </w:pPr>
             <w:r>
               <w:rPr>
@@ -11295,16 +11295,16 @@
           <w:tcPr>
             <w:tcW w:type="dxa" w:w="3000"/>
             <w:tcMar>
-              <w:top w:type="dxa" w:w="35"/>
+              <w:top w:type="dxa" w:w="25"/>
               <w:left w:type="dxa" w:w="110"/>
-              <w:bottom w:type="dxa" w:w="45"/>
-              <w:right w:type="dxa" w:w="90"/>
-            </w:tcMar>
-            <w:vAlign w:val="top"/>
-          </w:tcPr>
-          <w:p>
-            <w:pPr>
-              <w:spacing w:after="10"/>
+              <w:bottom w:type="dxa" w:w="30"/>
+              <w:right w:type="dxa" w:w="90"/>
+            </w:tcMar>
+            <w:vAlign w:val="top"/>
+          </w:tcPr>
+          <w:p>
+            <w:pPr>
+              <w:spacing w:after="0"/>
             </w:pPr>
             <w:r>
               <w:rPr>
@@ -11356,16 +11356,16 @@
           <w:tcPr>
             <w:tcW w:type="dxa" w:w="3000"/>
             <w:tcMar>
-              <w:top w:type="dxa" w:w="35"/>
+              <w:top w:type="dxa" w:w="25"/>
               <w:left w:type="dxa" w:w="110"/>
-              <w:bottom w:type="dxa" w:w="45"/>
-              <w:right w:type="dxa" w:w="90"/>
-            </w:tcMar>
-            <w:vAlign w:val="top"/>
-          </w:tcPr>
-          <w:p>
-            <w:pPr>
-              <w:spacing w:after="10"/>
+              <w:bottom w:type="dxa" w:w="30"/>
+              <w:right w:type="dxa" w:w="90"/>
+            </w:tcMar>
+            <w:vAlign w:val="top"/>
+          </w:tcPr>
+          <w:p>
+            <w:pPr>
+              <w:spacing w:after="0"/>
             </w:pPr>
             <w:r>
               <w:rPr>
@@ -11377,13 +11377,59 @@
                 <w:sz w:val="13"/>
                 <w:szCs w:val="13"/>
               </w:rPr>
-              <w:t xml:space="preserve">ENTER</w:t>
-            </w:r>
-          </w:p>
-          <w:p>
-            <w:pPr>
-              <w:spacing w:after="0"/>
-            </w:pPr>
+              <w:t xml:space="preserve">VALUE 3</w:t>
+            </w:r>
+          </w:p>
+          <w:p>
+            <w:pPr>
+              <w:spacing w:after="0"/>
+            </w:pPr>
+            <w:r>
+              <w:rPr>
+                <w:rFonts w:ascii="Arial" w:cs="Arial" w:eastAsia="Arial" w:hAnsi="Arial"/>
+                <w:b/>
+                <w:bCs/>
+                <w:color w:val="1A1A1A"/>
+                <w:sz w:val="19"/>
+                <w:szCs w:val="19"/>
+              </w:rPr>
+              <w:t xml:space="preserve">YOUR Appendix C → Seed Vault Humidity Setpoint</w:t>
+            </w:r>
+          </w:p>
+        </w:tc>
+      </w:tr>
+      <w:tr>
+        <w:trPr>
+          <w:cantSplit/>
+        </w:trPr>
+        <w:tc>
+          <w:tcPr>
+            <w:tcW w:type="dxa" w:w="9026"/>
+            <w:gridSpan w:val="3"/>
+            <w:tcMar>
+              <w:top w:type="dxa" w:w="20"/>
+              <w:left w:type="dxa" w:w="110"/>
+              <w:bottom w:type="dxa" w:w="25"/>
+              <w:right w:type="dxa" w:w="90"/>
+            </w:tcMar>
+            <w:vAlign w:val="center"/>
+          </w:tcPr>
+          <w:p>
+            <w:pPr>
+              <w:spacing w:after="0"/>
+            </w:pPr>
+            <w:r>
+              <w:rPr>
+                <w:rFonts w:ascii="Arial" w:cs="Arial" w:eastAsia="Arial" w:hAnsi="Arial"/>
+                <w:b/>
+                <w:bCs/>
+                <w:color w:val="6B6B6B"/>
+                <w:spacing w:val="60"/>
+                <w:sz w:val="13"/>
+                <w:szCs w:val="13"/>
+              </w:rPr>
+              <w:t xml:space="preserve">ENTER    </w:t>
+            </w:r>
             <w:r>
               <w:rPr>
                 <w:rFonts w:ascii="Courier New" w:cs="Courier New" w:eastAsia="Courier New" w:hAnsi="Courier New"/>
@@ -11393,7 +11439,7 @@
                 <w:sz w:val="22"/>
                 <w:szCs w:val="22"/>
               </w:rPr>
-              <w:t xml:space="preserve">P-08-[VALUE]-[VALUE 2]</w:t>
+              <w:t xml:space="preserve">P-08-[VALUE]-[VALUE 2]-[VALUE 3]</w:t>
             </w:r>
           </w:p>
         </w:tc>
@@ -11401,7 +11447,7 @@
     </w:tbl>
     <w:p>
       <w:pPr>
-        <w:spacing w:after="40"/>
+        <w:spacing w:after="24"/>
       </w:pPr>
     </w:p>
     <w:tbl>
@@ -11430,9 +11476,9 @@
             <w:tcW w:type="dxa" w:w="3000"/>
             <w:shd w:fill="DBEFDE" w:color="auto" w:val="clear"/>
             <w:tcMar>
-              <w:top w:type="dxa" w:w="30"/>
+              <w:top w:type="dxa" w:w="20"/>
               <w:left w:type="dxa" w:w="110"/>
-              <w:bottom w:type="dxa" w:w="30"/>
+              <w:bottom w:type="dxa" w:w="20"/>
               <w:right w:type="dxa" w:w="90"/>
             </w:tcMar>
             <w:vAlign w:val="center"/>
@@ -11460,9 +11506,9 @@
             <w:gridSpan w:val="2"/>
             <w:shd w:fill="DBEFDE" w:color="auto" w:val="clear"/>
             <w:tcMar>
-              <w:top w:type="dxa" w:w="30"/>
+              <w:top w:type="dxa" w:w="20"/>
               <w:left w:type="dxa" w:w="110"/>
-              <w:bottom w:type="dxa" w:w="30"/>
+              <w:bottom w:type="dxa" w:w="20"/>
               <w:right w:type="dxa" w:w="90"/>
             </w:tcMar>
             <w:vAlign w:val="center"/>
@@ -11493,16 +11539,16 @@
           <w:tcPr>
             <w:tcW w:type="dxa" w:w="3000"/>
             <w:tcMar>
-              <w:top w:type="dxa" w:w="35"/>
+              <w:top w:type="dxa" w:w="25"/>
               <w:left w:type="dxa" w:w="110"/>
-              <w:bottom w:type="dxa" w:w="45"/>
-              <w:right w:type="dxa" w:w="90"/>
-            </w:tcMar>
-            <w:vAlign w:val="top"/>
-          </w:tcPr>
-          <w:p>
-            <w:pPr>
-              <w:spacing w:after="10"/>
+              <w:bottom w:type="dxa" w:w="30"/>
+              <w:right w:type="dxa" w:w="90"/>
+            </w:tcMar>
+            <w:vAlign w:val="top"/>
+          </w:tcPr>
+          <w:p>
+            <w:pPr>
+              <w:spacing w:after="0"/>
             </w:pPr>
             <w:r>
               <w:rPr>
@@ -11538,16 +11584,16 @@
           <w:tcPr>
             <w:tcW w:type="dxa" w:w="3000"/>
             <w:tcMar>
-              <w:top w:type="dxa" w:w="35"/>
+              <w:top w:type="dxa" w:w="25"/>
               <w:left w:type="dxa" w:w="110"/>
-              <w:bottom w:type="dxa" w:w="45"/>
-              <w:right w:type="dxa" w:w="90"/>
-            </w:tcMar>
-            <w:vAlign w:val="top"/>
-          </w:tcPr>
-          <w:p>
-            <w:pPr>
-              <w:spacing w:after="10"/>
+              <w:bottom w:type="dxa" w:w="30"/>
+              <w:right w:type="dxa" w:w="90"/>
+            </w:tcMar>
+            <w:vAlign w:val="top"/>
+          </w:tcPr>
+          <w:p>
+            <w:pPr>
+              <w:spacing w:after="0"/>
             </w:pPr>
             <w:r>
               <w:rPr>
@@ -11583,16 +11629,16 @@
           <w:tcPr>
             <w:tcW w:type="dxa" w:w="3000"/>
             <w:tcMar>
-              <w:top w:type="dxa" w:w="35"/>
+              <w:top w:type="dxa" w:w="25"/>
               <w:left w:type="dxa" w:w="110"/>
-              <w:bottom w:type="dxa" w:w="45"/>
-              <w:right w:type="dxa" w:w="90"/>
-            </w:tcMar>
-            <w:vAlign w:val="top"/>
-          </w:tcPr>
-          <w:p>
-            <w:pPr>
-              <w:spacing w:after="10"/>
+              <w:bottom w:type="dxa" w:w="30"/>
+              <w:right w:type="dxa" w:w="90"/>
+            </w:tcMar>
+            <w:vAlign w:val="top"/>
+          </w:tcPr>
+          <w:p>
+            <w:pPr>
+              <w:spacing w:after="0"/>
             </w:pPr>
             <w:r>
               <w:rPr>
@@ -11633,16 +11679,16 @@
           <w:tcPr>
             <w:tcW w:type="dxa" w:w="3000"/>
             <w:tcMar>
-              <w:top w:type="dxa" w:w="35"/>
+              <w:top w:type="dxa" w:w="25"/>
               <w:left w:type="dxa" w:w="110"/>
-              <w:bottom w:type="dxa" w:w="45"/>
-              <w:right w:type="dxa" w:w="90"/>
-            </w:tcMar>
-            <w:vAlign w:val="top"/>
-          </w:tcPr>
-          <w:p>
-            <w:pPr>
-              <w:spacing w:after="10"/>
+              <w:bottom w:type="dxa" w:w="30"/>
+              <w:right w:type="dxa" w:w="90"/>
+            </w:tcMar>
+            <w:vAlign w:val="top"/>
+          </w:tcPr>
+          <w:p>
+            <w:pPr>
+              <w:spacing w:after="0"/>
             </w:pPr>
             <w:r>
               <w:rPr>
@@ -11678,16 +11724,16 @@
           <w:tcPr>
             <w:tcW w:type="dxa" w:w="3000"/>
             <w:tcMar>
-              <w:top w:type="dxa" w:w="35"/>
+              <w:top w:type="dxa" w:w="25"/>
               <w:left w:type="dxa" w:w="110"/>
-              <w:bottom w:type="dxa" w:w="45"/>
-              <w:right w:type="dxa" w:w="90"/>
-            </w:tcMar>
-            <w:vAlign w:val="top"/>
-          </w:tcPr>
-          <w:p>
-            <w:pPr>
-              <w:spacing w:after="10"/>
+              <w:bottom w:type="dxa" w:w="30"/>
+              <w:right w:type="dxa" w:w="90"/>
+            </w:tcMar>
+            <w:vAlign w:val="top"/>
+          </w:tcPr>
+          <w:p>
+            <w:pPr>
+              <w:spacing w:after="0"/>
             </w:pPr>
             <w:r>
               <w:rPr>
@@ -11723,16 +11769,16 @@
           <w:tcPr>
             <w:tcW w:type="dxa" w:w="3000"/>
             <w:tcMar>
-              <w:top w:type="dxa" w:w="35"/>
+              <w:top w:type="dxa" w:w="25"/>
               <w:left w:type="dxa" w:w="110"/>
-              <w:bottom w:type="dxa" w:w="45"/>
-              <w:right w:type="dxa" w:w="90"/>
-            </w:tcMar>
-            <w:vAlign w:val="top"/>
-          </w:tcPr>
-          <w:p>
-            <w:pPr>
-              <w:spacing w:after="10"/>
+              <w:bottom w:type="dxa" w:w="30"/>
+              <w:right w:type="dxa" w:w="90"/>
+            </w:tcMar>
+            <w:vAlign w:val="top"/>
+          </w:tcPr>
+          <w:p>
+            <w:pPr>
+              <w:spacing w:after="0"/>
             </w:pPr>
             <w:r>
               <w:rPr>
@@ -11744,13 +11790,59 @@
                 <w:sz w:val="13"/>
                 <w:szCs w:val="13"/>
               </w:rPr>
-              <w:t xml:space="preserve">ENTER</w:t>
-            </w:r>
-          </w:p>
-          <w:p>
-            <w:pPr>
-              <w:spacing w:after="0"/>
-            </w:pPr>
+              <w:t xml:space="preserve">VALUE 3</w:t>
+            </w:r>
+          </w:p>
+          <w:p>
+            <w:pPr>
+              <w:spacing w:after="0"/>
+            </w:pPr>
+            <w:r>
+              <w:rPr>
+                <w:rFonts w:ascii="Arial" w:cs="Arial" w:eastAsia="Arial" w:hAnsi="Arial"/>
+                <w:b/>
+                <w:bCs/>
+                <w:color w:val="1A1A1A"/>
+                <w:sz w:val="19"/>
+                <w:szCs w:val="19"/>
+              </w:rPr>
+              <w:t xml:space="preserve">POW → Table P-2 → Sub-grid 1</w:t>
+            </w:r>
+          </w:p>
+        </w:tc>
+      </w:tr>
+      <w:tr>
+        <w:trPr>
+          <w:cantSplit/>
+        </w:trPr>
+        <w:tc>
+          <w:tcPr>
+            <w:tcW w:type="dxa" w:w="9026"/>
+            <w:gridSpan w:val="3"/>
+            <w:tcMar>
+              <w:top w:type="dxa" w:w="20"/>
+              <w:left w:type="dxa" w:w="110"/>
+              <w:bottom w:type="dxa" w:w="25"/>
+              <w:right w:type="dxa" w:w="90"/>
+            </w:tcMar>
+            <w:vAlign w:val="center"/>
+          </w:tcPr>
+          <w:p>
+            <w:pPr>
+              <w:spacing w:after="0"/>
+            </w:pPr>
+            <w:r>
+              <w:rPr>
+                <w:rFonts w:ascii="Arial" w:cs="Arial" w:eastAsia="Arial" w:hAnsi="Arial"/>
+                <w:b/>
+                <w:bCs/>
+                <w:color w:val="6B6B6B"/>
+                <w:spacing w:val="60"/>
+                <w:sz w:val="13"/>
+                <w:szCs w:val="13"/>
+              </w:rPr>
+              <w:t xml:space="preserve">ENTER    </w:t>
+            </w:r>
             <w:r>
               <w:rPr>
                 <w:rFonts w:ascii="Courier New" w:cs="Courier New" w:eastAsia="Courier New" w:hAnsi="Courier New"/>
@@ -11760,7 +11852,7 @@
                 <w:sz w:val="22"/>
                 <w:szCs w:val="22"/>
               </w:rPr>
-              <w:t xml:space="preserve">P-09-[VALUE]-[VALUE 2]</w:t>
+              <w:t xml:space="preserve">P-09-[VALUE]-[VALUE 2]-[VALUE 3]</w:t>
             </w:r>
           </w:p>
         </w:tc>
@@ -11768,7 +11860,7 @@
     </w:tbl>
     <w:p>
       <w:pPr>
-        <w:spacing w:after="40"/>
+        <w:spacing w:after="24"/>
       </w:pPr>
     </w:p>
     <w:tbl>
@@ -11797,9 +11889,9 @@
             <w:tcW w:type="dxa" w:w="3000"/>
             <w:shd w:fill="DBEFDE" w:color="auto" w:val="clear"/>
             <w:tcMar>
-              <w:top w:type="dxa" w:w="30"/>
+              <w:top w:type="dxa" w:w="20"/>
               <w:left w:type="dxa" w:w="110"/>
-              <w:bottom w:type="dxa" w:w="30"/>
+              <w:bottom w:type="dxa" w:w="20"/>
               <w:right w:type="dxa" w:w="90"/>
             </w:tcMar>
             <w:vAlign w:val="center"/>
@@ -11827,9 +11919,9 @@
             <w:gridSpan w:val="2"/>
             <w:shd w:fill="DBEFDE" w:color="auto" w:val="clear"/>
             <w:tcMar>
-              <w:top w:type="dxa" w:w="30"/>
+              <w:top w:type="dxa" w:w="20"/>
               <w:left w:type="dxa" w:w="110"/>
-              <w:bottom w:type="dxa" w:w="30"/>
+              <w:bottom w:type="dxa" w:w="20"/>
               <w:right w:type="dxa" w:w="90"/>
             </w:tcMar>
             <w:vAlign w:val="center"/>
@@ -11871,16 +11963,16 @@
           <w:tcPr>
             <w:tcW w:type="dxa" w:w="3000"/>
             <w:tcMar>
-              <w:top w:type="dxa" w:w="35"/>
+              <w:top w:type="dxa" w:w="25"/>
               <w:left w:type="dxa" w:w="110"/>
-              <w:bottom w:type="dxa" w:w="45"/>
-              <w:right w:type="dxa" w:w="90"/>
-            </w:tcMar>
-            <w:vAlign w:val="top"/>
-          </w:tcPr>
-          <w:p>
-            <w:pPr>
-              <w:spacing w:after="10"/>
+              <w:bottom w:type="dxa" w:w="30"/>
+              <w:right w:type="dxa" w:w="90"/>
+            </w:tcMar>
+            <w:vAlign w:val="top"/>
+          </w:tcPr>
+          <w:p>
+            <w:pPr>
+              <w:spacing w:after="0"/>
             </w:pPr>
             <w:r>
               <w:rPr>
@@ -11916,16 +12008,16 @@
           <w:tcPr>
             <w:tcW w:type="dxa" w:w="3000"/>
             <w:tcMar>
-              <w:top w:type="dxa" w:w="35"/>
+              <w:top w:type="dxa" w:w="25"/>
               <w:left w:type="dxa" w:w="110"/>
-              <w:bottom w:type="dxa" w:w="45"/>
-              <w:right w:type="dxa" w:w="90"/>
-            </w:tcMar>
-            <w:vAlign w:val="top"/>
-          </w:tcPr>
-          <w:p>
-            <w:pPr>
-              <w:spacing w:after="10"/>
+              <w:bottom w:type="dxa" w:w="30"/>
+              <w:right w:type="dxa" w:w="90"/>
+            </w:tcMar>
+            <w:vAlign w:val="top"/>
+          </w:tcPr>
+          <w:p>
+            <w:pPr>
+              <w:spacing w:after="0"/>
             </w:pPr>
             <w:r>
               <w:rPr>
@@ -11961,16 +12053,16 @@
           <w:tcPr>
             <w:tcW w:type="dxa" w:w="3000"/>
             <w:tcMar>
-              <w:top w:type="dxa" w:w="35"/>
+              <w:top w:type="dxa" w:w="25"/>
               <w:left w:type="dxa" w:w="110"/>
-              <w:bottom w:type="dxa" w:w="45"/>
-              <w:right w:type="dxa" w:w="90"/>
-            </w:tcMar>
-            <w:vAlign w:val="top"/>
-          </w:tcPr>
-          <w:p>
-            <w:pPr>
-              <w:spacing w:after="10"/>
+              <w:bottom w:type="dxa" w:w="30"/>
+              <w:right w:type="dxa" w:w="90"/>
+            </w:tcMar>
+            <w:vAlign w:val="top"/>
+          </w:tcPr>
+          <w:p>
+            <w:pPr>
+              <w:spacing w:after="0"/>
             </w:pPr>
             <w:r>
               <w:rPr>
@@ -12011,16 +12103,16 @@
           <w:tcPr>
             <w:tcW w:type="dxa" w:w="3000"/>
             <w:tcMar>
-              <w:top w:type="dxa" w:w="35"/>
+              <w:top w:type="dxa" w:w="25"/>
               <w:left w:type="dxa" w:w="110"/>
-              <w:bottom w:type="dxa" w:w="45"/>
-              <w:right w:type="dxa" w:w="90"/>
-            </w:tcMar>
-            <w:vAlign w:val="top"/>
-          </w:tcPr>
-          <w:p>
-            <w:pPr>
-              <w:spacing w:after="10"/>
+              <w:bottom w:type="dxa" w:w="30"/>
+              <w:right w:type="dxa" w:w="90"/>
+            </w:tcMar>
+            <w:vAlign w:val="top"/>
+          </w:tcPr>
+          <w:p>
+            <w:pPr>
+              <w:spacing w:after="0"/>
             </w:pPr>
             <w:r>
               <w:rPr>
@@ -12056,16 +12148,16 @@
           <w:tcPr>
             <w:tcW w:type="dxa" w:w="3000"/>
             <w:tcMar>
-              <w:top w:type="dxa" w:w="35"/>
+              <w:top w:type="dxa" w:w="25"/>
               <w:left w:type="dxa" w:w="110"/>
-              <w:bottom w:type="dxa" w:w="45"/>
-              <w:right w:type="dxa" w:w="90"/>
-            </w:tcMar>
-            <w:vAlign w:val="top"/>
-          </w:tcPr>
-          <w:p>
-            <w:pPr>
-              <w:spacing w:after="10"/>
+              <w:bottom w:type="dxa" w:w="30"/>
+              <w:right w:type="dxa" w:w="90"/>
+            </w:tcMar>
+            <w:vAlign w:val="top"/>
+          </w:tcPr>
+          <w:p>
+            <w:pPr>
+              <w:spacing w:after="0"/>
             </w:pPr>
             <w:r>
               <w:rPr>
@@ -12101,16 +12193,16 @@
           <w:tcPr>
             <w:tcW w:type="dxa" w:w="3000"/>
             <w:tcMar>
-              <w:top w:type="dxa" w:w="35"/>
+              <w:top w:type="dxa" w:w="25"/>
               <w:left w:type="dxa" w:w="110"/>
-              <w:bottom w:type="dxa" w:w="45"/>
-              <w:right w:type="dxa" w:w="90"/>
-            </w:tcMar>
-            <w:vAlign w:val="top"/>
-          </w:tcPr>
-          <w:p>
-            <w:pPr>
-              <w:spacing w:after="10"/>
+              <w:bottom w:type="dxa" w:w="30"/>
+              <w:right w:type="dxa" w:w="90"/>
+            </w:tcMar>
+            <w:vAlign w:val="top"/>
+          </w:tcPr>
+          <w:p>
+            <w:pPr>
+              <w:spacing w:after="0"/>
             </w:pPr>
             <w:r>
               <w:rPr>
@@ -12146,7 +12238,7 @@
     </w:tbl>
     <w:p>
       <w:pPr>
-        <w:spacing w:after="40"/>
+        <w:spacing w:after="24"/>
       </w:pPr>
     </w:p>
     <w:p>

</xml_diff>